<commit_message>
Aggiunge checkbox dinamiche Liceo Scientifico e programmazione 4 Scienze Applicate
Rende selezionabili via `indirizzo` tutte le opzioni del Liceo Scientifico
nel template (corso base, Cambridge, Scienze Applicate, Informatica),
sostituendo le caselle grafiche statiche con lo stile ▣/☐ già usato per
AFM/SIA. Aggiunge la programmazione dipartimentale di Informatica per la
classe 4 Liceo Scientifico opzione Scienze Applicate, con riferimenti
DigComp 3.0 e CINI verificati contro i documenti in docs/riferimenti/.

Co-Authored-By: Claude Sonnet 5 <noreply@anthropic.com>
Claude-Session: https://claude.ai/code/session_01K4ue6iEQnnns7dQFNtDoJa
</commit_message>
<xml_diff>
--- a/templates/TEMPLATE_MOD_INS_01_B REV.02 Programm. Dipart. Triennio.docx
+++ b/templates/TEMPLATE_MOD_INS_01_B REV.02 Programm. Dipart. Triennio.docx
@@ -1369,6 +1369,7 @@
               <w:bottom w:w="80.0" w:type="dxa"/>
               <w:right w:w="80.0" w:type="dxa"/>
             </w:tcMar>
+            <w:vAlign w:val="center"/>
           </w:tcPr>
           <w:p>
             <w:pPr>
@@ -1396,539 +1397,80 @@
             <w:pPr>
               <w:spacing w:line="276" w:lineRule="auto"/>
               <w:jc w:val="center"/>
-              <w:rPr/>
-            </w:pPr>
-            <w:r>
               <w:rPr>
                 <w:rFonts w:ascii="Calibri" w:cs="Calibri" w:eastAsia="Calibri" w:hAnsi="Calibri"/>
                 <w:b w:val="1"/>
                 <w:bCs w:val="1"/>
-                <w:rtl w:val="0"/>
-              </w:rPr>
-              <w:t xml:space="preserve">         </w:t>
-            </w:r>
+              </w:rPr>
+            </w:pPr>
             <w:r>
               <w:rPr>
                 <w:rFonts w:ascii="Calibri" w:cs="Calibri" w:eastAsia="Calibri" w:hAnsi="Calibri"/>
                 <w:b w:val="1"/>
                 <w:bCs w:val="1"/>
-              </w:rPr>
-              <mc:AlternateContent>
-                <mc:Choice Requires="wpg">
-                  <w:drawing>
-                    <wp:inline distB="0" distT="0" distL="0" distR="0">
-                      <wp:extent cx="144780" cy="144780"/>
-                      <wp:effectExtent b="0" l="0" r="0" t="0"/>
-                      <wp:docPr id="1073741869" name=""/>
-                      <a:graphic>
-                        <a:graphicData uri="http://schemas.microsoft.com/office/word/2010/wordprocessingShape">
-                          <wps:wsp>
-                            <wps:cNvSpPr/>
-                            <wps:cNvPr id="7" name="Shape 7"/>
-                            <wps:spPr>
-                              <a:xfrm>
-                                <a:off x="5283135" y="3717135"/>
-                                <a:ext cx="125730" cy="125730"/>
-                              </a:xfrm>
-                              <a:prstGeom prst="rect">
-                                <a:avLst/>
-                              </a:prstGeom>
-                              <a:solidFill>
-                                <a:srgbClr val="FFFFFF"/>
-                              </a:solidFill>
-                              <a:ln cap="flat" cmpd="sng" w="9525">
-                                <a:solidFill>
-                                  <a:srgbClr val="000000"/>
-                                </a:solidFill>
-                                <a:prstDash val="solid"/>
-                                <a:round/>
-                                <a:headEnd len="sm" w="sm" type="none"/>
-                                <a:tailEnd len="sm" w="sm" type="none"/>
-                              </a:ln>
-                            </wps:spPr>
-                            <wps:txbx>
-                              <w:txbxContent>
-                                <w:p>
-                                  <w:pPr>
-                                    <w:spacing w:after="0" w:before="0" w:line="240"/>
-                                    <w:ind w:left="0" w:right="0" w:firstLine="0"/>
-                                    <w:jc w:val="left"/>
-                                    <w:textDirection w:val="btLr"/>
-                                  </w:pPr>
-                                </w:p>
-                              </w:txbxContent>
-                            </wps:txbx>
-                            <wps:bodyPr anchorCtr="0" anchor="ctr" bIns="91425" lIns="91425" spcFirstLastPara="1" rIns="91425" wrap="square" tIns="91425">
-                              <a:noAutofit/>
-                            </wps:bodyPr>
-                          </wps:wsp>
-                        </a:graphicData>
-                      </a:graphic>
-                    </wp:inline>
-                  </w:drawing>
-                </mc:Choice>
-                <mc:Fallback>
-                  <w:drawing>
-                    <wp:inline distB="0" distT="0" distL="0" distR="0">
-                      <wp:extent cx="144780" cy="144780"/>
-                      <wp:effectExtent b="0" l="0" r="0" t="0"/>
-                      <wp:docPr id="1073741869" name="image7.png"/>
-                      <a:graphic>
-                        <a:graphicData uri="http://schemas.openxmlformats.org/drawingml/2006/picture">
-                          <pic:pic>
-                            <pic:nvPicPr>
-                              <pic:cNvPr id="0" name="image7.png"/>
-                              <pic:cNvPicPr preferRelativeResize="0"/>
-                            </pic:nvPicPr>
-                            <pic:blipFill>
-                              <a:blip r:embed="rId7"/>
-                              <a:srcRect/>
-                              <a:stretch>
-                                <a:fillRect/>
-                              </a:stretch>
-                            </pic:blipFill>
-                            <pic:spPr>
-                              <a:xfrm>
-                                <a:off x="0" y="0"/>
-                                <a:ext cx="144780" cy="144780"/>
-                              </a:xfrm>
-                              <a:prstGeom prst="rect"/>
-                              <a:ln/>
-                            </pic:spPr>
-                          </pic:pic>
-                        </a:graphicData>
-                      </a:graphic>
-                    </wp:inline>
-                  </w:drawing>
-                </mc:Fallback>
-              </mc:AlternateContent>
-            </w:r>
-            <w:r>
+                <w:rtl w:val="0"/>
+              </w:rPr>
+              <w:t xml:space="preserve">{% if indirizzo == 'SCIENTIFICO' %}▣{% else %}☐{% endif %} CORSO BASE</w:t>
+            </w:r>
+          </w:p>
+          <w:p>
+            <w:pPr>
+              <w:spacing w:line="276" w:lineRule="auto"/>
+              <w:jc w:val="center"/>
               <w:rPr>
                 <w:rFonts w:ascii="Calibri" w:cs="Calibri" w:eastAsia="Calibri" w:hAnsi="Calibri"/>
                 <w:b w:val="1"/>
                 <w:bCs w:val="1"/>
-                <w:rtl w:val="0"/>
-              </w:rPr>
-              <w:t xml:space="preserve">    CORSO BASE      </w:t>
-            </w:r>
+              </w:rPr>
+            </w:pPr>
             <w:r>
               <w:rPr>
                 <w:rFonts w:ascii="Calibri" w:cs="Calibri" w:eastAsia="Calibri" w:hAnsi="Calibri"/>
                 <w:b w:val="1"/>
                 <w:bCs w:val="1"/>
-              </w:rPr>
-              <mc:AlternateContent>
-                <mc:Choice Requires="wpg">
-                  <w:drawing>
-                    <wp:inline distB="0" distT="0" distL="0" distR="0">
-                      <wp:extent cx="144780" cy="144780"/>
-                      <wp:effectExtent b="0" l="0" r="0" t="0"/>
-                      <wp:docPr id="1073741866" name=""/>
-                      <a:graphic>
-                        <a:graphicData uri="http://schemas.microsoft.com/office/word/2010/wordprocessingShape">
-                          <wps:wsp>
-                            <wps:cNvSpPr/>
-                            <wps:cNvPr id="4" name="Shape 4"/>
-                            <wps:spPr>
-                              <a:xfrm>
-                                <a:off x="5283135" y="3717135"/>
-                                <a:ext cx="125730" cy="125730"/>
-                              </a:xfrm>
-                              <a:prstGeom prst="rect">
-                                <a:avLst/>
-                              </a:prstGeom>
-                              <a:solidFill>
-                                <a:srgbClr val="FFFFFF"/>
-                              </a:solidFill>
-                              <a:ln cap="flat" cmpd="sng" w="9525">
-                                <a:solidFill>
-                                  <a:srgbClr val="000000"/>
-                                </a:solidFill>
-                                <a:prstDash val="solid"/>
-                                <a:round/>
-                                <a:headEnd len="sm" w="sm" type="none"/>
-                                <a:tailEnd len="sm" w="sm" type="none"/>
-                              </a:ln>
-                            </wps:spPr>
-                            <wps:txbx>
-                              <w:txbxContent>
-                                <w:p>
-                                  <w:pPr>
-                                    <w:spacing w:after="0" w:before="0" w:line="240"/>
-                                    <w:ind w:left="0" w:right="0" w:firstLine="0"/>
-                                    <w:jc w:val="left"/>
-                                    <w:textDirection w:val="btLr"/>
-                                  </w:pPr>
-                                </w:p>
-                              </w:txbxContent>
-                            </wps:txbx>
-                            <wps:bodyPr anchorCtr="0" anchor="ctr" bIns="91425" lIns="91425" spcFirstLastPara="1" rIns="91425" wrap="square" tIns="91425">
-                              <a:noAutofit/>
-                            </wps:bodyPr>
-                          </wps:wsp>
-                        </a:graphicData>
-                      </a:graphic>
-                    </wp:inline>
-                  </w:drawing>
-                </mc:Choice>
-                <mc:Fallback>
-                  <w:drawing>
-                    <wp:inline distB="0" distT="0" distL="0" distR="0">
-                      <wp:extent cx="144780" cy="144780"/>
-                      <wp:effectExtent b="0" l="0" r="0" t="0"/>
-                      <wp:docPr id="1073741866" name="image4.png"/>
-                      <a:graphic>
-                        <a:graphicData uri="http://schemas.openxmlformats.org/drawingml/2006/picture">
-                          <pic:pic>
-                            <pic:nvPicPr>
-                              <pic:cNvPr id="0" name="image4.png"/>
-                              <pic:cNvPicPr preferRelativeResize="0"/>
-                            </pic:nvPicPr>
-                            <pic:blipFill>
-                              <a:blip r:embed="rId7"/>
-                              <a:srcRect/>
-                              <a:stretch>
-                                <a:fillRect/>
-                              </a:stretch>
-                            </pic:blipFill>
-                            <pic:spPr>
-                              <a:xfrm>
-                                <a:off x="0" y="0"/>
-                                <a:ext cx="144780" cy="144780"/>
-                              </a:xfrm>
-                              <a:prstGeom prst="rect"/>
-                              <a:ln/>
-                            </pic:spPr>
-                          </pic:pic>
-                        </a:graphicData>
-                      </a:graphic>
-                    </wp:inline>
-                  </w:drawing>
-                </mc:Fallback>
-              </mc:AlternateContent>
-            </w:r>
-            <w:r>
+                <w:rtl w:val="0"/>
+              </w:rPr>
+              <w:t xml:space="preserve">{% if indirizzo == 'SCIENTIFICO_CAMBRIDGE' %}▣{% else %}☐{% endif %} CAMBRIDGE</w:t>
+            </w:r>
+          </w:p>
+          <w:p>
+            <w:pPr>
+              <w:spacing w:line="276" w:lineRule="auto"/>
+              <w:jc w:val="center"/>
               <w:rPr>
                 <w:rFonts w:ascii="Calibri" w:cs="Calibri" w:eastAsia="Calibri" w:hAnsi="Calibri"/>
                 <w:b w:val="1"/>
                 <w:bCs w:val="1"/>
-                <w:rtl w:val="0"/>
-              </w:rPr>
-              <w:t xml:space="preserve">   CAMBRIDGE        </w:t>
-            </w:r>
+              </w:rPr>
+            </w:pPr>
             <w:r>
               <w:rPr>
                 <w:rFonts w:ascii="Calibri" w:cs="Calibri" w:eastAsia="Calibri" w:hAnsi="Calibri"/>
                 <w:b w:val="1"/>
                 <w:bCs w:val="1"/>
-              </w:rPr>
-              <mc:AlternateContent>
-                <mc:Choice Requires="wpg">
-                  <w:drawing>
-                    <wp:inline distB="0" distT="0" distL="0" distR="0">
-                      <wp:extent cx="144780" cy="144780"/>
-                      <wp:effectExtent b="0" l="0" r="0" t="0"/>
-                      <wp:docPr id="1073741867" name=""/>
-                      <a:graphic>
-                        <a:graphicData uri="http://schemas.microsoft.com/office/word/2010/wordprocessingShape">
-                          <wps:wsp>
-                            <wps:cNvSpPr/>
-                            <wps:cNvPr id="5" name="Shape 5"/>
-                            <wps:spPr>
-                              <a:xfrm>
-                                <a:off x="5283135" y="3717135"/>
-                                <a:ext cx="125730" cy="125730"/>
-                              </a:xfrm>
-                              <a:prstGeom prst="rect">
-                                <a:avLst/>
-                              </a:prstGeom>
-                              <a:solidFill>
-                                <a:srgbClr val="FFFFFF"/>
-                              </a:solidFill>
-                              <a:ln cap="flat" cmpd="sng" w="9525">
-                                <a:solidFill>
-                                  <a:srgbClr val="000000"/>
-                                </a:solidFill>
-                                <a:prstDash val="solid"/>
-                                <a:round/>
-                                <a:headEnd len="sm" w="sm" type="none"/>
-                                <a:tailEnd len="sm" w="sm" type="none"/>
-                              </a:ln>
-                            </wps:spPr>
-                            <wps:txbx>
-                              <w:txbxContent>
-                                <w:p>
-                                  <w:pPr>
-                                    <w:spacing w:after="0" w:before="0" w:line="240"/>
-                                    <w:ind w:left="0" w:right="0" w:firstLine="0"/>
-                                    <w:jc w:val="left"/>
-                                    <w:textDirection w:val="btLr"/>
-                                  </w:pPr>
-                                </w:p>
-                              </w:txbxContent>
-                            </wps:txbx>
-                            <wps:bodyPr anchorCtr="0" anchor="ctr" bIns="91425" lIns="91425" spcFirstLastPara="1" rIns="91425" wrap="square" tIns="91425">
-                              <a:noAutofit/>
-                            </wps:bodyPr>
-                          </wps:wsp>
-                        </a:graphicData>
-                      </a:graphic>
-                    </wp:inline>
-                  </w:drawing>
-                </mc:Choice>
-                <mc:Fallback>
-                  <w:drawing>
-                    <wp:inline distB="0" distT="0" distL="0" distR="0">
-                      <wp:extent cx="144780" cy="144780"/>
-                      <wp:effectExtent b="0" l="0" r="0" t="0"/>
-                      <wp:docPr id="1073741867" name="image5.png"/>
-                      <a:graphic>
-                        <a:graphicData uri="http://schemas.openxmlformats.org/drawingml/2006/picture">
-                          <pic:pic>
-                            <pic:nvPicPr>
-                              <pic:cNvPr id="0" name="image5.png"/>
-                              <pic:cNvPicPr preferRelativeResize="0"/>
-                            </pic:nvPicPr>
-                            <pic:blipFill>
-                              <a:blip r:embed="rId7"/>
-                              <a:srcRect/>
-                              <a:stretch>
-                                <a:fillRect/>
-                              </a:stretch>
-                            </pic:blipFill>
-                            <pic:spPr>
-                              <a:xfrm>
-                                <a:off x="0" y="0"/>
-                                <a:ext cx="144780" cy="144780"/>
-                              </a:xfrm>
-                              <a:prstGeom prst="rect"/>
-                              <a:ln/>
-                            </pic:spPr>
-                          </pic:pic>
-                        </a:graphicData>
-                      </a:graphic>
-                    </wp:inline>
-                  </w:drawing>
-                </mc:Fallback>
-              </mc:AlternateContent>
-            </w:r>
-            <w:r>
+                <w:rtl w:val="0"/>
+              </w:rPr>
+              <w:t xml:space="preserve">{% if indirizzo == 'SCIENTIFICO_SCIENZE_APPLICATE' %}▣{% else %}☐{% endif %} SCIENZE APPLICATE</w:t>
+            </w:r>
+          </w:p>
+          <w:p>
+            <w:pPr>
+              <w:spacing w:line="276" w:lineRule="auto"/>
+              <w:jc w:val="center"/>
               <w:rPr>
                 <w:rFonts w:ascii="Calibri" w:cs="Calibri" w:eastAsia="Calibri" w:hAnsi="Calibri"/>
                 <w:b w:val="1"/>
                 <w:bCs w:val="1"/>
-                <w:rtl w:val="0"/>
-              </w:rPr>
-              <w:t xml:space="preserve">   SCIENZE APPLICATE  </w:t>
-            </w:r>
+              </w:rPr>
+            </w:pPr>
             <w:r>
               <w:rPr>
                 <w:rFonts w:ascii="Calibri" w:cs="Calibri" w:eastAsia="Calibri" w:hAnsi="Calibri"/>
                 <w:b w:val="1"/>
                 <w:bCs w:val="1"/>
-              </w:rPr>
-              <mc:AlternateContent>
-                <mc:Choice Requires="wpg">
-                  <w:drawing>
-                    <wp:inline distB="0" distT="0" distL="0" distR="0">
-                      <wp:extent cx="144780" cy="144780"/>
-                      <wp:effectExtent b="0" l="0" r="0" t="0"/>
-                      <wp:docPr id="1073741864" name=""/>
-                      <a:graphic>
-                        <a:graphicData uri="http://schemas.microsoft.com/office/word/2010/wordprocessingShape">
-                          <wps:wsp>
-                            <wps:cNvSpPr/>
-                            <wps:cNvPr id="2" name="Shape 2"/>
-                            <wps:spPr>
-                              <a:xfrm>
-                                <a:off x="5283135" y="3717135"/>
-                                <a:ext cx="125730" cy="125730"/>
-                              </a:xfrm>
-                              <a:prstGeom prst="rect">
-                                <a:avLst/>
-                              </a:prstGeom>
-                              <a:noFill/>
-                              <a:ln>
-                                <a:noFill/>
-                              </a:ln>
-                            </wps:spPr>
-                            <wps:txbx>
-                              <w:txbxContent>
-                                <w:p>
-                                  <w:pPr>
-                                    <w:spacing w:after="0" w:before="0" w:line="240"/>
-                                    <w:ind w:left="0" w:right="0" w:firstLine="0"/>
-                                    <w:jc w:val="left"/>
-                                    <w:textDirection w:val="btLr"/>
-                                  </w:pPr>
-                                </w:p>
-                              </w:txbxContent>
-                            </wps:txbx>
-                            <wps:bodyPr anchorCtr="0" anchor="ctr" bIns="91425" lIns="91425" spcFirstLastPara="1" rIns="91425" wrap="square" tIns="91425">
-                              <a:noAutofit/>
-                            </wps:bodyPr>
-                          </wps:wsp>
-                        </a:graphicData>
-                      </a:graphic>
-                    </wp:inline>
-                  </w:drawing>
-                </mc:Choice>
-                <mc:Fallback>
-                  <w:drawing>
-                    <wp:inline distB="0" distT="0" distL="0" distR="0">
-                      <wp:extent cx="144780" cy="144780"/>
-                      <wp:effectExtent b="0" l="0" r="0" t="0"/>
-                      <wp:docPr id="1073741864" name="image2.png"/>
-                      <a:graphic>
-                        <a:graphicData uri="http://schemas.openxmlformats.org/drawingml/2006/picture">
-                          <pic:pic>
-                            <pic:nvPicPr>
-                              <pic:cNvPr id="0" name="image2.png"/>
-                              <pic:cNvPicPr preferRelativeResize="0"/>
-                            </pic:nvPicPr>
-                            <pic:blipFill>
-                              <a:blip r:embed="rId7"/>
-                              <a:srcRect/>
-                              <a:stretch>
-                                <a:fillRect/>
-                              </a:stretch>
-                            </pic:blipFill>
-                            <pic:spPr>
-                              <a:xfrm>
-                                <a:off x="0" y="0"/>
-                                <a:ext cx="144780" cy="144780"/>
-                              </a:xfrm>
-                              <a:prstGeom prst="rect"/>
-                              <a:ln/>
-                            </pic:spPr>
-                          </pic:pic>
-                        </a:graphicData>
-                      </a:graphic>
-                    </wp:inline>
-                  </w:drawing>
-                </mc:Fallback>
-              </mc:AlternateContent>
-            </w:r>
-            <w:r>
-              <w:rPr>
-                <w:rFonts w:ascii="Calibri" w:cs="Calibri" w:eastAsia="Calibri" w:hAnsi="Calibri"/>
-                <w:b w:val="1"/>
-                <w:bCs w:val="1"/>
-                <w:rtl w:val="0"/>
-              </w:rPr>
-              <w:t xml:space="preserve"> </w:t>
-              <w:br w:type="textWrapping"/>
-            </w:r>
-            <w:r>
-              <w:rPr>
-                <w:rFonts w:ascii="Calibri" w:cs="Calibri" w:eastAsia="Calibri" w:hAnsi="Calibri"/>
-                <w:b w:val="1"/>
-                <w:bCs w:val="1"/>
-              </w:rPr>
-              <mc:AlternateContent>
-                <mc:Choice Requires="wpg">
-                  <w:drawing>
-                    <wp:inline distB="0" distT="0" distL="0" distR="0">
-                      <wp:extent cx="144780" cy="144780"/>
-                      <wp:effectExtent b="0" l="0" r="0" t="0"/>
-                      <wp:docPr id="1073741865" name=""/>
-                      <a:graphic>
-                        <a:graphicData uri="http://schemas.microsoft.com/office/word/2010/wordprocessingShape">
-                          <wps:wsp>
-                            <wps:cNvSpPr/>
-                            <wps:cNvPr id="3" name="Shape 3"/>
-                            <wps:spPr>
-                              <a:xfrm>
-                                <a:off x="5283135" y="3717135"/>
-                                <a:ext cx="125730" cy="125730"/>
-                              </a:xfrm>
-                              <a:prstGeom prst="rect">
-                                <a:avLst/>
-                              </a:prstGeom>
-                              <a:solidFill>
-                                <a:srgbClr val="FFFFFF"/>
-                              </a:solidFill>
-                              <a:ln cap="flat" cmpd="sng" w="9525">
-                                <a:solidFill>
-                                  <a:srgbClr val="000000"/>
-                                </a:solidFill>
-                                <a:prstDash val="solid"/>
-                                <a:round/>
-                                <a:headEnd len="sm" w="sm" type="none"/>
-                                <a:tailEnd len="sm" w="sm" type="none"/>
-                              </a:ln>
-                            </wps:spPr>
-                            <wps:txbx>
-                              <w:txbxContent>
-                                <w:p>
-                                  <w:pPr>
-                                    <w:spacing w:after="0" w:before="0" w:line="240"/>
-                                    <w:ind w:left="0" w:right="0" w:firstLine="0"/>
-                                    <w:jc w:val="left"/>
-                                    <w:textDirection w:val="btLr"/>
-                                  </w:pPr>
-                                </w:p>
-                              </w:txbxContent>
-                            </wps:txbx>
-                            <wps:bodyPr anchorCtr="0" anchor="ctr" bIns="91425" lIns="91425" spcFirstLastPara="1" rIns="91425" wrap="square" tIns="91425">
-                              <a:noAutofit/>
-                            </wps:bodyPr>
-                          </wps:wsp>
-                        </a:graphicData>
-                      </a:graphic>
-                    </wp:inline>
-                  </w:drawing>
-                </mc:Choice>
-                <mc:Fallback>
-                  <w:drawing>
-                    <wp:inline distB="0" distT="0" distL="0" distR="0">
-                      <wp:extent cx="144780" cy="144780"/>
-                      <wp:effectExtent b="0" l="0" r="0" t="0"/>
-                      <wp:docPr id="1073741865" name="image3.png"/>
-                      <a:graphic>
-                        <a:graphicData uri="http://schemas.openxmlformats.org/drawingml/2006/picture">
-                          <pic:pic>
-                            <pic:nvPicPr>
-                              <pic:cNvPr id="0" name="image3.png"/>
-                              <pic:cNvPicPr preferRelativeResize="0"/>
-                            </pic:nvPicPr>
-                            <pic:blipFill>
-                              <a:blip r:embed="rId7"/>
-                              <a:srcRect/>
-                              <a:stretch>
-                                <a:fillRect/>
-                              </a:stretch>
-                            </pic:blipFill>
-                            <pic:spPr>
-                              <a:xfrm>
-                                <a:off x="0" y="0"/>
-                                <a:ext cx="144780" cy="144780"/>
-                              </a:xfrm>
-                              <a:prstGeom prst="rect"/>
-                              <a:ln/>
-                            </pic:spPr>
-                          </pic:pic>
-                        </a:graphicData>
-                      </a:graphic>
-                    </wp:inline>
-                  </w:drawing>
-                </mc:Fallback>
-              </mc:AlternateContent>
-            </w:r>
-            <w:r>
-              <w:rPr>
-                <w:rFonts w:ascii="Calibri" w:cs="Calibri" w:eastAsia="Calibri" w:hAnsi="Calibri"/>
-                <w:b w:val="1"/>
-                <w:bCs w:val="1"/>
-                <w:rtl w:val="0"/>
-              </w:rPr>
-              <w:t xml:space="preserve">  INFORMATICA </w:t>
-            </w:r>
-            <w:r>
-              <w:rPr>
-                <w:rtl w:val="0"/>
-              </w:rPr>
+                <w:rtl w:val="0"/>
+              </w:rPr>
+              <w:t xml:space="preserve">{% if indirizzo == 'SCIENTIFICO_INFORMATICA' %}▣{% else %}☐{% endif %} INFORMATICA</w:t>
             </w:r>
           </w:p>
         </w:tc>

</xml_diff>